<commit_message>
Papa tut. Artemka svali!
</commit_message>
<xml_diff>
--- a/Лабораторная работа 1 Колесников 8В31.docx
+++ b/Лабораторная работа 1 Колесников 8В31.docx
@@ -1,6 +1,6 @@
 
 <file path=word/document.xml><?xml version="1.0" encoding="utf-8"?>
-<w:document xmlns:wpc="http://schemas.microsoft.com/office/word/2010/wordprocessingCanvas" xmlns:cx="http://schemas.microsoft.com/office/drawing/2014/chartex" xmlns:cx1="http://schemas.microsoft.com/office/drawing/2015/9/8/chartex" xmlns:cx2="http://schemas.microsoft.com/office/drawing/2015/10/21/chartex" xmlns:cx3="http://schemas.microsoft.com/office/drawing/2016/5/9/chartex" xmlns:cx4="http://schemas.microsoft.com/office/drawing/2016/5/10/chartex" xmlns:cx5="http://schemas.microsoft.com/office/drawing/2016/5/11/chartex" xmlns:cx6="http://schemas.microsoft.com/office/drawing/2016/5/12/chartex" xmlns:cx7="http://schemas.microsoft.com/office/drawing/2016/5/13/chartex" xmlns:cx8="http://schemas.microsoft.com/office/drawing/2016/5/14/chartex" xmlns:mc="http://schemas.openxmlformats.org/markup-compatibility/2006" xmlns:aink="http://schemas.microsoft.com/office/drawing/2016/ink" xmlns:am3d="http://schemas.microsoft.com/office/drawing/2017/model3d" xmlns:o="urn:schemas-microsoft-com:office:office" xmlns:oel="http://schemas.microsoft.com/office/2019/extlst" xmlns:r="http://schemas.openxmlformats.org/officeDocument/2006/relationships" xmlns:m="http://schemas.openxmlformats.org/officeDocument/2006/math" xmlns:v="urn:schemas-microsoft-com:vml" xmlns:wp14="http://schemas.microsoft.com/office/word/2010/wordprocessingDrawing" xmlns:wp="http://schemas.openxmlformats.org/drawingml/2006/wordprocessingDrawing" xmlns:w10="urn:schemas-microsoft-com:office:word" xmlns:w="http://schemas.openxmlformats.org/wordprocessingml/2006/main" xmlns:w14="http://schemas.microsoft.com/office/word/2010/wordml" xmlns:w15="http://schemas.microsoft.com/office/word/2012/wordml" xmlns:w16cex="http://schemas.microsoft.com/office/word/2018/wordml/cex" xmlns:w16cid="http://schemas.microsoft.com/office/word/2016/wordml/cid" xmlns:w16="http://schemas.microsoft.com/office/word/2018/wordml" xmlns:w16du="http://schemas.microsoft.com/office/word/2023/wordml/word16du" xmlns:w16sdtdh="http://schemas.microsoft.com/office/word/2020/wordml/sdtdatahash" xmlns:w16sdtfl="http://schemas.microsoft.com/office/word/2024/wordml/sdtformatlock" xmlns:w16se="http://schemas.microsoft.com/office/word/2015/wordml/symex" xmlns:wpg="http://schemas.microsoft.com/office/word/2010/wordprocessingGroup" xmlns:wpi="http://schemas.microsoft.com/office/word/2010/wordprocessingInk" xmlns:wne="http://schemas.microsoft.com/office/word/2006/wordml" xmlns:wps="http://schemas.microsoft.com/office/word/2010/wordprocessingShape" mc:Ignorable="w14 w15 w16se w16cid w16 w16cex w16sdtdh w16sdtfl w16du wp14">
+<w:document xmlns:wpc="http://schemas.microsoft.com/office/word/2010/wordprocessingCanvas" xmlns:cx="http://schemas.microsoft.com/office/drawing/2014/chartex" xmlns:cx1="http://schemas.microsoft.com/office/drawing/2015/9/8/chartex" xmlns:mc="http://schemas.openxmlformats.org/markup-compatibility/2006" xmlns:o="urn:schemas-microsoft-com:office:office" xmlns:r="http://schemas.openxmlformats.org/officeDocument/2006/relationships" xmlns:m="http://schemas.openxmlformats.org/officeDocument/2006/math" xmlns:v="urn:schemas-microsoft-com:vml" xmlns:wp14="http://schemas.microsoft.com/office/word/2010/wordprocessingDrawing" xmlns:wp="http://schemas.openxmlformats.org/drawingml/2006/wordprocessingDrawing" xmlns:w10="urn:schemas-microsoft-com:office:word" xmlns:w="http://schemas.openxmlformats.org/wordprocessingml/2006/main" xmlns:w14="http://schemas.microsoft.com/office/word/2010/wordml" xmlns:w15="http://schemas.microsoft.com/office/word/2012/wordml" xmlns:w16se="http://schemas.microsoft.com/office/word/2015/wordml/symex" xmlns:wpg="http://schemas.microsoft.com/office/word/2010/wordprocessingGroup" xmlns:wpi="http://schemas.microsoft.com/office/word/2010/wordprocessingInk" xmlns:wne="http://schemas.microsoft.com/office/word/2006/wordml" xmlns:wps="http://schemas.microsoft.com/office/word/2010/wordprocessingShape" mc:Ignorable="w14 w15 w16se wp14">
   <w:body>
     <w:p>
       <w:pPr>
@@ -11,6 +11,51 @@
         <w:t>Тенденции на рынке труда</w:t>
       </w:r>
       <w:bookmarkEnd w:id="0"/>
+    </w:p>
+    <w:p>
+      <w:r>
+        <w:rPr>
+          <w:noProof/>
+          <w:lang w:eastAsia="ru-RU"/>
+        </w:rPr>
+        <w:drawing>
+          <wp:inline distT="0" distB="0" distL="0" distR="0" wp14:anchorId="3356729E" wp14:editId="4038B3AC">
+            <wp:extent cx="5940425" cy="7920355"/>
+            <wp:effectExtent l="0" t="0" r="3175" b="4445"/>
+            <wp:docPr id="5" name="Рисунок 5"/>
+            <wp:cNvGraphicFramePr>
+              <a:graphicFrameLocks xmlns:a="http://schemas.openxmlformats.org/drawingml/2006/main" noChangeAspect="1"/>
+            </wp:cNvGraphicFramePr>
+            <a:graphic xmlns:a="http://schemas.openxmlformats.org/drawingml/2006/main">
+              <a:graphicData uri="http://schemas.openxmlformats.org/drawingml/2006/picture">
+                <pic:pic xmlns:pic="http://schemas.openxmlformats.org/drawingml/2006/picture">
+                  <pic:nvPicPr>
+                    <pic:cNvPr id="1" name=""/>
+                    <pic:cNvPicPr/>
+                  </pic:nvPicPr>
+                  <pic:blipFill>
+                    <a:blip r:embed="rId7"/>
+                    <a:stretch>
+                      <a:fillRect/>
+                    </a:stretch>
+                  </pic:blipFill>
+                  <pic:spPr>
+                    <a:xfrm>
+                      <a:off x="0" y="0"/>
+                      <a:ext cx="5940425" cy="7920355"/>
+                    </a:xfrm>
+                    <a:prstGeom prst="rect">
+                      <a:avLst/>
+                    </a:prstGeom>
+                  </pic:spPr>
+                </pic:pic>
+              </a:graphicData>
+            </a:graphic>
+          </wp:inline>
+        </w:drawing>
+      </w:r>
+      <w:bookmarkStart w:id="1" w:name="_GoBack"/>
+      <w:bookmarkEnd w:id="1"/>
     </w:p>
     <w:p>
       <w:pPr>
@@ -356,12 +401,12 @@
       <w:pPr>
         <w:pStyle w:val="2"/>
       </w:pPr>
-      <w:bookmarkStart w:id="1" w:name="_Toc190289244"/>
+      <w:bookmarkStart w:id="2" w:name="_Toc190289244"/>
       <w:r>
         <w:lastRenderedPageBreak/>
         <w:t>Экономическая активность населения.</w:t>
       </w:r>
-      <w:bookmarkEnd w:id="1"/>
+      <w:bookmarkEnd w:id="2"/>
     </w:p>
     <w:p>
       <w:r>
@@ -371,50 +416,12 @@
         <w:t>15</w:t>
       </w:r>
       <w:r>
-        <w:t xml:space="preserve">-72 лет (занятые + безработные) составила 74,8 </w:t>
-      </w:r>
-      <w:proofErr w:type="spellStart"/>
-      <w:proofErr w:type="gramStart"/>
-      <w:r>
-        <w:t>млн.человек</w:t>
-      </w:r>
-      <w:proofErr w:type="spellEnd"/>
-      <w:proofErr w:type="gramEnd"/>
-      <w:r>
-        <w:t>. Уровень экономической активности населения в возрасте 15-72 лет (отношение численности экономически активного населения к общей численности населения данной возрастной группы) составил 67,4%.</w:t>
+        <w:t>-72 лет (занятые + безработные) составила 74,8 млн.человек. Уровень экономической активности населения в возрасте 15-72 лет (отношение численности экономически активного населения к общей численности населения данной возрастной группы) составил 67,4%.</w:t>
       </w:r>
     </w:p>
     <w:p>
       <w:r>
-        <w:t xml:space="preserve">В численности экономически активного населения 69,9 </w:t>
-      </w:r>
-      <w:proofErr w:type="spellStart"/>
-      <w:proofErr w:type="gramStart"/>
-      <w:r>
-        <w:t>млн.человек</w:t>
-      </w:r>
-      <w:proofErr w:type="spellEnd"/>
-      <w:proofErr w:type="gramEnd"/>
-      <w:r>
-        <w:t xml:space="preserve"> классифицировались как занятые экономической деятельностью и 4,9 </w:t>
-      </w:r>
-      <w:proofErr w:type="spellStart"/>
-      <w:r>
-        <w:t>млн.человек</w:t>
-      </w:r>
-      <w:proofErr w:type="spellEnd"/>
-      <w:r>
-        <w:t xml:space="preserve"> - как безработные с применением критериев МОТ (то есть не имели работы или доходного занятия, искали работу и были готовы приступить к ней в обследуемую неделю). По сравнению с I кварталом 2011г. численность занятого населения увеличилась на 0,5 млн. человек, или на 0,7%, численность безработных сократилась на 0,7 </w:t>
-      </w:r>
-      <w:proofErr w:type="spellStart"/>
-      <w:proofErr w:type="gramStart"/>
-      <w:r>
-        <w:t>млн.человек</w:t>
-      </w:r>
-      <w:proofErr w:type="spellEnd"/>
-      <w:proofErr w:type="gramEnd"/>
-      <w:r>
-        <w:t>, или на 13,3%.</w:t>
+        <w:t>В численности экономически активного населения 69,9 млн.человек классифицировались как занятые экономической деятельностью и 4,9 млн.человек - как безработные с применением критериев МОТ (то есть не имели работы или доходного занятия, искали работу и были готовы приступить к ней в обследуемую неделю). По сравнению с I кварталом 2011г. численность занятого населения увеличилась на 0,5 млн. человек, или на 0,7%, численность безработных сократилась на 0,7 млн.человек, или на 13,3%.</w:t>
       </w:r>
     </w:p>
     <w:p>
@@ -441,7 +448,7 @@
                     </pic:cNvPicPr>
                   </pic:nvPicPr>
                   <pic:blipFill>
-                    <a:blip r:embed="rId7">
+                    <a:blip r:embed="rId8">
                       <a:extLst>
                         <a:ext uri="{28A0092B-C50C-407E-A947-70E740481C1C}">
                           <a14:useLocalDpi xmlns:a14="http://schemas.microsoft.com/office/drawing/2010/main" val="0"/>
@@ -482,12 +489,12 @@
       <w:pPr>
         <w:pStyle w:val="2"/>
       </w:pPr>
-      <w:bookmarkStart w:id="2" w:name="_Toc190289245"/>
+      <w:bookmarkStart w:id="3" w:name="_Toc190289245"/>
       <w:r>
         <w:lastRenderedPageBreak/>
         <w:t>Безработица среди мужчин и женщин.</w:t>
       </w:r>
-      <w:bookmarkEnd w:id="2"/>
+      <w:bookmarkEnd w:id="3"/>
     </w:p>
     <w:p>
       <w:r>
@@ -538,7 +545,7 @@
                     </pic:cNvPicPr>
                   </pic:nvPicPr>
                   <pic:blipFill>
-                    <a:blip r:embed="rId8">
+                    <a:blip r:embed="rId9">
                       <a:extLst>
                         <a:ext uri="{28A0092B-C50C-407E-A947-70E740481C1C}">
                           <a14:useLocalDpi xmlns:a14="http://schemas.microsoft.com/office/drawing/2010/main" val="0"/>
@@ -588,11 +595,11 @@
       <w:pPr>
         <w:pStyle w:val="2"/>
       </w:pPr>
-      <w:bookmarkStart w:id="3" w:name="_Toc190289246"/>
+      <w:bookmarkStart w:id="4" w:name="_Toc190289246"/>
       <w:r>
         <w:t>Занятость, безработица и уровень образования населения.</w:t>
       </w:r>
-      <w:bookmarkEnd w:id="3"/>
+      <w:bookmarkEnd w:id="4"/>
     </w:p>
     <w:p>
       <w:r>
@@ -634,7 +641,7 @@
                     </pic:cNvPicPr>
                   </pic:nvPicPr>
                   <pic:blipFill>
-                    <a:blip r:embed="rId9">
+                    <a:blip r:embed="rId10">
                       <a:extLst>
                         <a:ext uri="{28A0092B-C50C-407E-A947-70E740481C1C}">
                           <a14:useLocalDpi xmlns:a14="http://schemas.microsoft.com/office/drawing/2010/main" val="0"/>
@@ -724,7 +731,7 @@
                     </pic:cNvPicPr>
                   </pic:nvPicPr>
                   <pic:blipFill>
-                    <a:blip r:embed="rId10">
+                    <a:blip r:embed="rId11">
                       <a:extLst>
                         <a:ext uri="{28A0092B-C50C-407E-A947-70E740481C1C}">
                           <a14:useLocalDpi xmlns:a14="http://schemas.microsoft.com/office/drawing/2010/main" val="0"/>
@@ -776,7 +783,7 @@
       <w:pPr>
         <w:pStyle w:val="a8"/>
         <w:sectPr>
-          <w:footerReference w:type="default" r:id="rId11"/>
+          <w:footerReference w:type="default" r:id="rId12"/>
           <w:type w:val="continuous"/>
           <w:pgSz w:w="11906" w:h="16838"/>
           <w:pgMar w:top="1134" w:right="850" w:bottom="1134" w:left="1701" w:header="708" w:footer="708" w:gutter="0"/>
@@ -854,15 +861,8 @@
               <w:cnfStyle w:val="100000000000" w:firstRow="1" w:lastRow="0" w:firstColumn="0" w:lastColumn="0" w:oddVBand="0" w:evenVBand="0" w:oddHBand="0" w:evenHBand="0" w:firstRowFirstColumn="0" w:firstRowLastColumn="0" w:lastRowFirstColumn="0" w:lastRowLastColumn="0"/>
             </w:pPr>
             <w:r>
-              <w:t xml:space="preserve">Экономически активное население, </w:t>
-            </w:r>
-            <w:proofErr w:type="spellStart"/>
-            <w:proofErr w:type="gramStart"/>
-            <w:r>
-              <w:t>тыс.человек</w:t>
-            </w:r>
-            <w:proofErr w:type="spellEnd"/>
-            <w:proofErr w:type="gramEnd"/>
+              <w:t>Экономически активное население, тыс.человек</w:t>
+            </w:r>
           </w:p>
         </w:tc>
         <w:tc>
@@ -1358,13 +1358,8 @@
           </w:tcPr>
           <w:p>
             <w:r>
-              <w:t xml:space="preserve">образование и </w:t>
-            </w:r>
-            <w:proofErr w:type="spellStart"/>
-            <w:r>
-              <w:t>педогогика</w:t>
-            </w:r>
-            <w:proofErr w:type="spellEnd"/>
+              <w:t>образование и педогогика</w:t>
+            </w:r>
           </w:p>
         </w:tc>
         <w:tc>
@@ -1889,12 +1884,8 @@
             </w:r>
             <w:r>
               <w:br/>
-            </w:r>
-            <w:proofErr w:type="spellStart"/>
-            <w:r>
               <w:t>материалообработка</w:t>
             </w:r>
-            <w:proofErr w:type="spellEnd"/>
           </w:p>
         </w:tc>
         <w:tc>
@@ -2434,7 +2425,7 @@
 </file>
 
 <file path=word/endnotes.xml><?xml version="1.0" encoding="utf-8"?>
-<w:endnotes xmlns:wpc="http://schemas.microsoft.com/office/word/2010/wordprocessingCanvas" xmlns:cx="http://schemas.microsoft.com/office/drawing/2014/chartex" xmlns:cx1="http://schemas.microsoft.com/office/drawing/2015/9/8/chartex" xmlns:cx2="http://schemas.microsoft.com/office/drawing/2015/10/21/chartex" xmlns:cx3="http://schemas.microsoft.com/office/drawing/2016/5/9/chartex" xmlns:cx4="http://schemas.microsoft.com/office/drawing/2016/5/10/chartex" xmlns:cx5="http://schemas.microsoft.com/office/drawing/2016/5/11/chartex" xmlns:cx6="http://schemas.microsoft.com/office/drawing/2016/5/12/chartex" xmlns:cx7="http://schemas.microsoft.com/office/drawing/2016/5/13/chartex" xmlns:cx8="http://schemas.microsoft.com/office/drawing/2016/5/14/chartex" xmlns:mc="http://schemas.openxmlformats.org/markup-compatibility/2006" xmlns:aink="http://schemas.microsoft.com/office/drawing/2016/ink" xmlns:am3d="http://schemas.microsoft.com/office/drawing/2017/model3d" xmlns:o="urn:schemas-microsoft-com:office:office" xmlns:oel="http://schemas.microsoft.com/office/2019/extlst" xmlns:r="http://schemas.openxmlformats.org/officeDocument/2006/relationships" xmlns:m="http://schemas.openxmlformats.org/officeDocument/2006/math" xmlns:v="urn:schemas-microsoft-com:vml" xmlns:wp14="http://schemas.microsoft.com/office/word/2010/wordprocessingDrawing" xmlns:wp="http://schemas.openxmlformats.org/drawingml/2006/wordprocessingDrawing" xmlns:w10="urn:schemas-microsoft-com:office:word" xmlns:w="http://schemas.openxmlformats.org/wordprocessingml/2006/main" xmlns:w14="http://schemas.microsoft.com/office/word/2010/wordml" xmlns:w15="http://schemas.microsoft.com/office/word/2012/wordml" xmlns:w16cex="http://schemas.microsoft.com/office/word/2018/wordml/cex" xmlns:w16cid="http://schemas.microsoft.com/office/word/2016/wordml/cid" xmlns:w16="http://schemas.microsoft.com/office/word/2018/wordml" xmlns:w16du="http://schemas.microsoft.com/office/word/2023/wordml/word16du" xmlns:w16sdtdh="http://schemas.microsoft.com/office/word/2020/wordml/sdtdatahash" xmlns:w16sdtfl="http://schemas.microsoft.com/office/word/2024/wordml/sdtformatlock" xmlns:w16se="http://schemas.microsoft.com/office/word/2015/wordml/symex" xmlns:wpg="http://schemas.microsoft.com/office/word/2010/wordprocessingGroup" xmlns:wpi="http://schemas.microsoft.com/office/word/2010/wordprocessingInk" xmlns:wne="http://schemas.microsoft.com/office/word/2006/wordml" xmlns:wps="http://schemas.microsoft.com/office/word/2010/wordprocessingShape" mc:Ignorable="w14 w15 w16se w16cid w16 w16cex w16sdtdh w16sdtfl w16du wp14">
+<w:endnotes xmlns:wpc="http://schemas.microsoft.com/office/word/2010/wordprocessingCanvas" xmlns:cx="http://schemas.microsoft.com/office/drawing/2014/chartex" xmlns:cx1="http://schemas.microsoft.com/office/drawing/2015/9/8/chartex" xmlns:mc="http://schemas.openxmlformats.org/markup-compatibility/2006" xmlns:o="urn:schemas-microsoft-com:office:office" xmlns:r="http://schemas.openxmlformats.org/officeDocument/2006/relationships" xmlns:m="http://schemas.openxmlformats.org/officeDocument/2006/math" xmlns:v="urn:schemas-microsoft-com:vml" xmlns:wp14="http://schemas.microsoft.com/office/word/2010/wordprocessingDrawing" xmlns:wp="http://schemas.openxmlformats.org/drawingml/2006/wordprocessingDrawing" xmlns:w10="urn:schemas-microsoft-com:office:word" xmlns:w="http://schemas.openxmlformats.org/wordprocessingml/2006/main" xmlns:w14="http://schemas.microsoft.com/office/word/2010/wordml" xmlns:w15="http://schemas.microsoft.com/office/word/2012/wordml" xmlns:w16se="http://schemas.microsoft.com/office/word/2015/wordml/symex" xmlns:wpg="http://schemas.microsoft.com/office/word/2010/wordprocessingGroup" xmlns:wpi="http://schemas.microsoft.com/office/word/2010/wordprocessingInk" xmlns:wne="http://schemas.microsoft.com/office/word/2006/wordml" xmlns:wps="http://schemas.microsoft.com/office/word/2010/wordprocessingShape" mc:Ignorable="w14 w15 w16se wp14">
   <w:endnote w:type="separator" w:id="-1">
     <w:p>
       <w:pPr>
@@ -2459,7 +2450,7 @@
 </file>
 
 <file path=word/footer1.xml><?xml version="1.0" encoding="utf-8"?>
-<w:ftr xmlns:wpc="http://schemas.microsoft.com/office/word/2010/wordprocessingCanvas" xmlns:cx="http://schemas.microsoft.com/office/drawing/2014/chartex" xmlns:cx1="http://schemas.microsoft.com/office/drawing/2015/9/8/chartex" xmlns:cx2="http://schemas.microsoft.com/office/drawing/2015/10/21/chartex" xmlns:cx3="http://schemas.microsoft.com/office/drawing/2016/5/9/chartex" xmlns:cx4="http://schemas.microsoft.com/office/drawing/2016/5/10/chartex" xmlns:cx5="http://schemas.microsoft.com/office/drawing/2016/5/11/chartex" xmlns:cx6="http://schemas.microsoft.com/office/drawing/2016/5/12/chartex" xmlns:cx7="http://schemas.microsoft.com/office/drawing/2016/5/13/chartex" xmlns:cx8="http://schemas.microsoft.com/office/drawing/2016/5/14/chartex" xmlns:mc="http://schemas.openxmlformats.org/markup-compatibility/2006" xmlns:aink="http://schemas.microsoft.com/office/drawing/2016/ink" xmlns:am3d="http://schemas.microsoft.com/office/drawing/2017/model3d" xmlns:o="urn:schemas-microsoft-com:office:office" xmlns:oel="http://schemas.microsoft.com/office/2019/extlst" xmlns:r="http://schemas.openxmlformats.org/officeDocument/2006/relationships" xmlns:m="http://schemas.openxmlformats.org/officeDocument/2006/math" xmlns:v="urn:schemas-microsoft-com:vml" xmlns:wp14="http://schemas.microsoft.com/office/word/2010/wordprocessingDrawing" xmlns:wp="http://schemas.openxmlformats.org/drawingml/2006/wordprocessingDrawing" xmlns:w10="urn:schemas-microsoft-com:office:word" xmlns:w="http://schemas.openxmlformats.org/wordprocessingml/2006/main" xmlns:w14="http://schemas.microsoft.com/office/word/2010/wordml" xmlns:w15="http://schemas.microsoft.com/office/word/2012/wordml" xmlns:w16cex="http://schemas.microsoft.com/office/word/2018/wordml/cex" xmlns:w16cid="http://schemas.microsoft.com/office/word/2016/wordml/cid" xmlns:w16="http://schemas.microsoft.com/office/word/2018/wordml" xmlns:w16du="http://schemas.microsoft.com/office/word/2023/wordml/word16du" xmlns:w16sdtdh="http://schemas.microsoft.com/office/word/2020/wordml/sdtdatahash" xmlns:w16sdtfl="http://schemas.microsoft.com/office/word/2024/wordml/sdtformatlock" xmlns:w16se="http://schemas.microsoft.com/office/word/2015/wordml/symex" xmlns:wpg="http://schemas.microsoft.com/office/word/2010/wordprocessingGroup" xmlns:wpi="http://schemas.microsoft.com/office/word/2010/wordprocessingInk" xmlns:wne="http://schemas.microsoft.com/office/word/2006/wordml" xmlns:wps="http://schemas.microsoft.com/office/word/2010/wordprocessingShape" mc:Ignorable="w14 w15 w16se w16cid w16 w16cex w16sdtdh w16sdtfl w16du wp14">
+<w:ftr xmlns:wpc="http://schemas.microsoft.com/office/word/2010/wordprocessingCanvas" xmlns:cx="http://schemas.microsoft.com/office/drawing/2014/chartex" xmlns:cx1="http://schemas.microsoft.com/office/drawing/2015/9/8/chartex" xmlns:mc="http://schemas.openxmlformats.org/markup-compatibility/2006" xmlns:o="urn:schemas-microsoft-com:office:office" xmlns:r="http://schemas.openxmlformats.org/officeDocument/2006/relationships" xmlns:m="http://schemas.openxmlformats.org/officeDocument/2006/math" xmlns:v="urn:schemas-microsoft-com:vml" xmlns:wp14="http://schemas.microsoft.com/office/word/2010/wordprocessingDrawing" xmlns:wp="http://schemas.openxmlformats.org/drawingml/2006/wordprocessingDrawing" xmlns:w10="urn:schemas-microsoft-com:office:word" xmlns:w="http://schemas.openxmlformats.org/wordprocessingml/2006/main" xmlns:w14="http://schemas.microsoft.com/office/word/2010/wordml" xmlns:w15="http://schemas.microsoft.com/office/word/2012/wordml" xmlns:w16se="http://schemas.microsoft.com/office/word/2015/wordml/symex" xmlns:wpg="http://schemas.microsoft.com/office/word/2010/wordprocessingGroup" xmlns:wpi="http://schemas.microsoft.com/office/word/2010/wordprocessingInk" xmlns:wne="http://schemas.microsoft.com/office/word/2006/wordml" xmlns:wps="http://schemas.microsoft.com/office/word/2010/wordprocessingShape" mc:Ignorable="w14 w15 w16se wp14">
   <w:sdt>
     <w:sdtPr>
       <w:id w:val="965465656"/>
@@ -2468,6 +2459,7 @@
         <w:docPartUnique/>
       </w:docPartObj>
     </w:sdtPr>
+    <w:sdtEndPr/>
     <w:sdtContent>
       <w:p>
         <w:pPr>
@@ -2484,7 +2476,10 @@
           <w:fldChar w:fldCharType="separate"/>
         </w:r>
         <w:r>
-          <w:t>2</w:t>
+          <w:rPr>
+            <w:noProof/>
+          </w:rPr>
+          <w:t>1</w:t>
         </w:r>
         <w:r>
           <w:fldChar w:fldCharType="end"/>
@@ -2501,7 +2496,7 @@
 </file>
 
 <file path=word/footnotes.xml><?xml version="1.0" encoding="utf-8"?>
-<w:footnotes xmlns:wpc="http://schemas.microsoft.com/office/word/2010/wordprocessingCanvas" xmlns:cx="http://schemas.microsoft.com/office/drawing/2014/chartex" xmlns:cx1="http://schemas.microsoft.com/office/drawing/2015/9/8/chartex" xmlns:cx2="http://schemas.microsoft.com/office/drawing/2015/10/21/chartex" xmlns:cx3="http://schemas.microsoft.com/office/drawing/2016/5/9/chartex" xmlns:cx4="http://schemas.microsoft.com/office/drawing/2016/5/10/chartex" xmlns:cx5="http://schemas.microsoft.com/office/drawing/2016/5/11/chartex" xmlns:cx6="http://schemas.microsoft.com/office/drawing/2016/5/12/chartex" xmlns:cx7="http://schemas.microsoft.com/office/drawing/2016/5/13/chartex" xmlns:cx8="http://schemas.microsoft.com/office/drawing/2016/5/14/chartex" xmlns:mc="http://schemas.openxmlformats.org/markup-compatibility/2006" xmlns:aink="http://schemas.microsoft.com/office/drawing/2016/ink" xmlns:am3d="http://schemas.microsoft.com/office/drawing/2017/model3d" xmlns:o="urn:schemas-microsoft-com:office:office" xmlns:oel="http://schemas.microsoft.com/office/2019/extlst" xmlns:r="http://schemas.openxmlformats.org/officeDocument/2006/relationships" xmlns:m="http://schemas.openxmlformats.org/officeDocument/2006/math" xmlns:v="urn:schemas-microsoft-com:vml" xmlns:wp14="http://schemas.microsoft.com/office/word/2010/wordprocessingDrawing" xmlns:wp="http://schemas.openxmlformats.org/drawingml/2006/wordprocessingDrawing" xmlns:w10="urn:schemas-microsoft-com:office:word" xmlns:w="http://schemas.openxmlformats.org/wordprocessingml/2006/main" xmlns:w14="http://schemas.microsoft.com/office/word/2010/wordml" xmlns:w15="http://schemas.microsoft.com/office/word/2012/wordml" xmlns:w16cex="http://schemas.microsoft.com/office/word/2018/wordml/cex" xmlns:w16cid="http://schemas.microsoft.com/office/word/2016/wordml/cid" xmlns:w16="http://schemas.microsoft.com/office/word/2018/wordml" xmlns:w16du="http://schemas.microsoft.com/office/word/2023/wordml/word16du" xmlns:w16sdtdh="http://schemas.microsoft.com/office/word/2020/wordml/sdtdatahash" xmlns:w16sdtfl="http://schemas.microsoft.com/office/word/2024/wordml/sdtformatlock" xmlns:w16se="http://schemas.microsoft.com/office/word/2015/wordml/symex" xmlns:wpg="http://schemas.microsoft.com/office/word/2010/wordprocessingGroup" xmlns:wpi="http://schemas.microsoft.com/office/word/2010/wordprocessingInk" xmlns:wne="http://schemas.microsoft.com/office/word/2006/wordml" xmlns:wps="http://schemas.microsoft.com/office/word/2010/wordprocessingShape" mc:Ignorable="w14 w15 w16se w16cid w16 w16cex w16sdtdh w16sdtfl w16du wp14">
+<w:footnotes xmlns:wpc="http://schemas.microsoft.com/office/word/2010/wordprocessingCanvas" xmlns:cx="http://schemas.microsoft.com/office/drawing/2014/chartex" xmlns:cx1="http://schemas.microsoft.com/office/drawing/2015/9/8/chartex" xmlns:mc="http://schemas.openxmlformats.org/markup-compatibility/2006" xmlns:o="urn:schemas-microsoft-com:office:office" xmlns:r="http://schemas.openxmlformats.org/officeDocument/2006/relationships" xmlns:m="http://schemas.openxmlformats.org/officeDocument/2006/math" xmlns:v="urn:schemas-microsoft-com:vml" xmlns:wp14="http://schemas.microsoft.com/office/word/2010/wordprocessingDrawing" xmlns:wp="http://schemas.openxmlformats.org/drawingml/2006/wordprocessingDrawing" xmlns:w10="urn:schemas-microsoft-com:office:word" xmlns:w="http://schemas.openxmlformats.org/wordprocessingml/2006/main" xmlns:w14="http://schemas.microsoft.com/office/word/2010/wordml" xmlns:w15="http://schemas.microsoft.com/office/word/2012/wordml" xmlns:w16se="http://schemas.microsoft.com/office/word/2015/wordml/symex" xmlns:wpg="http://schemas.microsoft.com/office/word/2010/wordprocessingGroup" xmlns:wpi="http://schemas.microsoft.com/office/word/2010/wordprocessingInk" xmlns:wne="http://schemas.microsoft.com/office/word/2006/wordml" xmlns:wps="http://schemas.microsoft.com/office/word/2010/wordprocessingShape" mc:Ignorable="w14 w15 w16se wp14">
   <w:footnote w:type="separator" w:id="-1">
     <w:p>
       <w:pPr>
@@ -2583,7 +2578,7 @@
 </file>
 
 <file path=word/styles.xml><?xml version="1.0" encoding="utf-8"?>
-<w:styles xmlns:mc="http://schemas.openxmlformats.org/markup-compatibility/2006" xmlns:r="http://schemas.openxmlformats.org/officeDocument/2006/relationships" xmlns:w="http://schemas.openxmlformats.org/wordprocessingml/2006/main" xmlns:w14="http://schemas.microsoft.com/office/word/2010/wordml" xmlns:w15="http://schemas.microsoft.com/office/word/2012/wordml" xmlns:w16cex="http://schemas.microsoft.com/office/word/2018/wordml/cex" xmlns:w16cid="http://schemas.microsoft.com/office/word/2016/wordml/cid" xmlns:w16="http://schemas.microsoft.com/office/word/2018/wordml" xmlns:w16du="http://schemas.microsoft.com/office/word/2023/wordml/word16du" xmlns:w16sdtdh="http://schemas.microsoft.com/office/word/2020/wordml/sdtdatahash" xmlns:w16sdtfl="http://schemas.microsoft.com/office/word/2024/wordml/sdtformatlock" xmlns:w16se="http://schemas.microsoft.com/office/word/2015/wordml/symex" mc:Ignorable="w14 w15 w16se w16cid w16 w16cex w16sdtdh w16sdtfl w16du">
+<w:styles xmlns:mc="http://schemas.openxmlformats.org/markup-compatibility/2006" xmlns:r="http://schemas.openxmlformats.org/officeDocument/2006/relationships" xmlns:w="http://schemas.openxmlformats.org/wordprocessingml/2006/main" xmlns:w14="http://schemas.microsoft.com/office/word/2010/wordml" xmlns:w15="http://schemas.microsoft.com/office/word/2012/wordml" xmlns:w16se="http://schemas.microsoft.com/office/word/2015/wordml/symex" mc:Ignorable="w14 w15 w16se">
   <w:docDefaults>
     <w:rPrDefault>
       <w:rPr>
@@ -2593,7 +2588,7 @@
     </w:rPrDefault>
     <w:pPrDefault/>
   </w:docDefaults>
-  <w:latentStyles w:defLockedState="0" w:defUIPriority="99" w:defSemiHidden="0" w:defUnhideWhenUsed="0" w:defQFormat="0" w:count="376">
+  <w:latentStyles w:defLockedState="0" w:defUIPriority="99" w:defSemiHidden="0" w:defUnhideWhenUsed="0" w:defQFormat="0" w:count="371">
     <w:lsdException w:name="Normal" w:uiPriority="0" w:qFormat="1"/>
     <w:lsdException w:name="heading 1" w:uiPriority="9" w:qFormat="1"/>
     <w:lsdException w:name="heading 2" w:semiHidden="1" w:uiPriority="9" w:unhideWhenUsed="1" w:qFormat="1"/>
@@ -2965,11 +2960,6 @@
     <w:lsdException w:name="List Table 5 Dark Accent 6" w:uiPriority="50"/>
     <w:lsdException w:name="List Table 6 Colorful Accent 6" w:uiPriority="51"/>
     <w:lsdException w:name="List Table 7 Colorful Accent 6" w:uiPriority="52"/>
-    <w:lsdException w:name="Mention" w:semiHidden="1" w:unhideWhenUsed="1"/>
-    <w:lsdException w:name="Smart Hyperlink" w:semiHidden="1" w:unhideWhenUsed="1"/>
-    <w:lsdException w:name="Hashtag" w:semiHidden="1" w:unhideWhenUsed="1"/>
-    <w:lsdException w:name="Unresolved Mention" w:semiHidden="1" w:unhideWhenUsed="1"/>
-    <w:lsdException w:name="Smart Link" w:semiHidden="1" w:unhideWhenUsed="1"/>
   </w:latentStyles>
   <w:style w:type="paragraph" w:default="1" w:styleId="a">
     <w:name w:val="Normal"/>
@@ -3037,6 +3027,7 @@
   <w:style w:type="character" w:default="1" w:styleId="a0">
     <w:name w:val="Default Paragraph Font"/>
     <w:uiPriority w:val="1"/>
+    <w:semiHidden/>
     <w:unhideWhenUsed/>
   </w:style>
   <w:style w:type="table" w:default="1" w:styleId="a1">
@@ -3900,7 +3891,7 @@
 </file>
 
 <file path=customXml/itemProps1.xml><?xml version="1.0" encoding="utf-8"?>
-<ds:datastoreItem xmlns:ds="http://schemas.openxmlformats.org/officeDocument/2006/customXml" ds:itemID="{68A907E6-AA81-40FD-874E-0D54477128B9}">
+<ds:datastoreItem xmlns:ds="http://schemas.openxmlformats.org/officeDocument/2006/customXml" ds:itemID="{3D2632B4-65CF-457A-87A8-985E02490CB0}">
   <ds:schemaRefs>
     <ds:schemaRef ds:uri="http://schemas.openxmlformats.org/officeDocument/2006/bibliography"/>
   </ds:schemaRefs>

</xml_diff>